<commit_message>
subindo o trabalho finalizado
</commit_message>
<xml_diff>
--- a/apostila/Apostila Space For Men (Recuperação Automática).docx
+++ b/apostila/Apostila Space For Men (Recuperação Automática).docx
@@ -21591,6 +21591,7 @@
       </w:pPr>
       <w:r>
         <w:rPr>
+          <w:noProof/>
           <w:sz w:val="24"/>
           <w:szCs w:val="24"/>
         </w:rPr>
@@ -21768,6 +21769,7 @@
       </w:pPr>
       <w:r>
         <w:rPr>
+          <w:noProof/>
           <w:sz w:val="24"/>
           <w:szCs w:val="24"/>
         </w:rPr>
@@ -22041,6 +22043,7 @@
       </w:r>
       <w:r>
         <w:rPr>
+          <w:noProof/>
           <w:sz w:val="24"/>
           <w:szCs w:val="24"/>
         </w:rPr>
@@ -22095,6 +22098,7 @@
       </w:pPr>
       <w:r>
         <w:rPr>
+          <w:noProof/>
           <w:sz w:val="24"/>
           <w:szCs w:val="24"/>
         </w:rPr>
@@ -22332,6 +22336,7 @@
       </w:r>
       <w:r>
         <w:rPr>
+          <w:noProof/>
           <w:sz w:val="24"/>
           <w:szCs w:val="24"/>
         </w:rPr>
@@ -22430,9 +22435,9 @@
           <w:szCs w:val="24"/>
         </w:rPr>
       </w:pPr>
-      <w:bookmarkStart w:id="0" w:name="_GoBack"/>
-      <w:r>
-        <w:rPr>
+      <w:r>
+        <w:rPr>
+          <w:noProof/>
           <w:sz w:val="24"/>
           <w:szCs w:val="24"/>
         </w:rPr>
@@ -22472,33 +22477,1426 @@
           </wp:inline>
         </w:drawing>
       </w:r>
+    </w:p>
+    <w:p>
+      <w:pPr>
+        <w:pStyle w:val="PargrafodaLista"/>
+        <w:tabs>
+          <w:tab w:val="left" w:pos="1275"/>
+        </w:tabs>
+        <w:ind w:left="1080"/>
+        <w:rPr>
+          <w:sz w:val="24"/>
+          <w:szCs w:val="24"/>
+        </w:rPr>
+      </w:pPr>
+    </w:p>
+    <w:p>
+      <w:pPr>
+        <w:pStyle w:val="PargrafodaLista"/>
+        <w:tabs>
+          <w:tab w:val="left" w:pos="1275"/>
+        </w:tabs>
+        <w:ind w:left="1080"/>
+        <w:rPr>
+          <w:sz w:val="24"/>
+          <w:szCs w:val="24"/>
+        </w:rPr>
+      </w:pPr>
+    </w:p>
+    <w:p>
+      <w:pPr>
+        <w:pStyle w:val="PargrafodaLista"/>
+        <w:tabs>
+          <w:tab w:val="left" w:pos="1275"/>
+        </w:tabs>
+        <w:ind w:left="1080"/>
+        <w:rPr>
+          <w:sz w:val="24"/>
+          <w:szCs w:val="24"/>
+        </w:rPr>
+      </w:pPr>
+      <w:r>
+        <w:rPr>
+          <w:sz w:val="24"/>
+          <w:szCs w:val="24"/>
+        </w:rPr>
+        <w:t xml:space="preserve">102 – </w:t>
+      </w:r>
+      <w:proofErr w:type="gramStart"/>
+      <w:r>
+        <w:rPr>
+          <w:sz w:val="24"/>
+          <w:szCs w:val="24"/>
+        </w:rPr>
+        <w:t>da</w:t>
+      </w:r>
+      <w:proofErr w:type="gramEnd"/>
+      <w:r>
+        <w:rPr>
+          <w:sz w:val="24"/>
+          <w:szCs w:val="24"/>
+        </w:rPr>
+        <w:t xml:space="preserve"> mesma forma que realizamos no arquivo style.css para deixar a pagina responsiva, vamos fazer o mesmo código conforme a imagem abaixo, para deixar a pagina produto pronta para ser visualizada pelo celular.</w:t>
+      </w:r>
+    </w:p>
+    <w:p>
+      <w:pPr>
+        <w:pStyle w:val="PargrafodaLista"/>
+        <w:tabs>
+          <w:tab w:val="left" w:pos="1275"/>
+        </w:tabs>
+        <w:ind w:left="1080"/>
+        <w:rPr>
+          <w:sz w:val="24"/>
+          <w:szCs w:val="24"/>
+        </w:rPr>
+      </w:pPr>
+      <w:r>
+        <w:rPr>
+          <w:sz w:val="24"/>
+          <w:szCs w:val="24"/>
+        </w:rPr>
+        <w:drawing>
+          <wp:inline distT="0" distB="0" distL="0" distR="0" wp14:anchorId="272EF42E" wp14:editId="565839D3">
+            <wp:extent cx="3343742" cy="876422"/>
+            <wp:effectExtent l="0" t="0" r="9525" b="0"/>
+            <wp:docPr id="191" name="Imagem 191"/>
+            <wp:cNvGraphicFramePr>
+              <a:graphicFrameLocks xmlns:a="http://schemas.openxmlformats.org/drawingml/2006/main" noChangeAspect="1"/>
+            </wp:cNvGraphicFramePr>
+            <a:graphic xmlns:a="http://schemas.openxmlformats.org/drawingml/2006/main">
+              <a:graphicData uri="http://schemas.openxmlformats.org/drawingml/2006/picture">
+                <pic:pic xmlns:pic="http://schemas.openxmlformats.org/drawingml/2006/picture">
+                  <pic:nvPicPr>
+                    <pic:cNvPr id="1" name=""/>
+                    <pic:cNvPicPr/>
+                  </pic:nvPicPr>
+                  <pic:blipFill>
+                    <a:blip r:embed="rId153"/>
+                    <a:stretch>
+                      <a:fillRect/>
+                    </a:stretch>
+                  </pic:blipFill>
+                  <pic:spPr>
+                    <a:xfrm>
+                      <a:off x="0" y="0"/>
+                      <a:ext cx="3343742" cy="876422"/>
+                    </a:xfrm>
+                    <a:prstGeom prst="rect">
+                      <a:avLst/>
+                    </a:prstGeom>
+                  </pic:spPr>
+                </pic:pic>
+              </a:graphicData>
+            </a:graphic>
+          </wp:inline>
+        </w:drawing>
+      </w:r>
+    </w:p>
+    <w:p>
+      <w:pPr>
+        <w:pStyle w:val="PargrafodaLista"/>
+        <w:tabs>
+          <w:tab w:val="left" w:pos="1275"/>
+        </w:tabs>
+        <w:ind w:left="1080"/>
+        <w:rPr>
+          <w:sz w:val="24"/>
+          <w:szCs w:val="24"/>
+        </w:rPr>
+      </w:pPr>
+    </w:p>
+    <w:p>
+      <w:pPr>
+        <w:pStyle w:val="PargrafodaLista"/>
+        <w:tabs>
+          <w:tab w:val="left" w:pos="1275"/>
+        </w:tabs>
+        <w:ind w:left="1080"/>
+        <w:rPr>
+          <w:sz w:val="24"/>
+          <w:szCs w:val="24"/>
+        </w:rPr>
+      </w:pPr>
+      <w:r>
+        <w:rPr>
+          <w:sz w:val="24"/>
+          <w:szCs w:val="24"/>
+        </w:rPr>
+        <w:lastRenderedPageBreak/>
+        <w:t xml:space="preserve">103 – </w:t>
+      </w:r>
+      <w:proofErr w:type="gramStart"/>
+      <w:r>
+        <w:rPr>
+          <w:sz w:val="24"/>
+          <w:szCs w:val="24"/>
+        </w:rPr>
+        <w:t>como</w:t>
+      </w:r>
+      <w:proofErr w:type="gramEnd"/>
+      <w:r>
+        <w:rPr>
+          <w:sz w:val="24"/>
+          <w:szCs w:val="24"/>
+        </w:rPr>
+        <w:t xml:space="preserve"> o menu é o mesmo para as três páginas, para deixar o menu responsivo, o código se repete</w:t>
+      </w:r>
+    </w:p>
+    <w:p>
+      <w:pPr>
+        <w:pStyle w:val="PargrafodaLista"/>
+        <w:tabs>
+          <w:tab w:val="left" w:pos="1275"/>
+        </w:tabs>
+        <w:ind w:left="1080"/>
+        <w:rPr>
+          <w:sz w:val="24"/>
+          <w:szCs w:val="24"/>
+        </w:rPr>
+      </w:pPr>
+      <w:r>
+        <w:rPr>
+          <w:sz w:val="24"/>
+          <w:szCs w:val="24"/>
+        </w:rPr>
+        <w:drawing>
+          <wp:inline distT="0" distB="0" distL="0" distR="0" wp14:anchorId="4CB61CD5" wp14:editId="2F30BAAF">
+            <wp:extent cx="3019846" cy="3086531"/>
+            <wp:effectExtent l="0" t="0" r="0" b="0"/>
+            <wp:docPr id="192" name="Imagem 192"/>
+            <wp:cNvGraphicFramePr>
+              <a:graphicFrameLocks xmlns:a="http://schemas.openxmlformats.org/drawingml/2006/main" noChangeAspect="1"/>
+            </wp:cNvGraphicFramePr>
+            <a:graphic xmlns:a="http://schemas.openxmlformats.org/drawingml/2006/main">
+              <a:graphicData uri="http://schemas.openxmlformats.org/drawingml/2006/picture">
+                <pic:pic xmlns:pic="http://schemas.openxmlformats.org/drawingml/2006/picture">
+                  <pic:nvPicPr>
+                    <pic:cNvPr id="1" name=""/>
+                    <pic:cNvPicPr/>
+                  </pic:nvPicPr>
+                  <pic:blipFill>
+                    <a:blip r:embed="rId154"/>
+                    <a:stretch>
+                      <a:fillRect/>
+                    </a:stretch>
+                  </pic:blipFill>
+                  <pic:spPr>
+                    <a:xfrm>
+                      <a:off x="0" y="0"/>
+                      <a:ext cx="3019846" cy="3086531"/>
+                    </a:xfrm>
+                    <a:prstGeom prst="rect">
+                      <a:avLst/>
+                    </a:prstGeom>
+                  </pic:spPr>
+                </pic:pic>
+              </a:graphicData>
+            </a:graphic>
+          </wp:inline>
+        </w:drawing>
+      </w:r>
+    </w:p>
+    <w:p>
+      <w:pPr>
+        <w:pStyle w:val="PargrafodaLista"/>
+        <w:tabs>
+          <w:tab w:val="left" w:pos="1275"/>
+        </w:tabs>
+        <w:ind w:left="1080"/>
+        <w:rPr>
+          <w:sz w:val="24"/>
+          <w:szCs w:val="24"/>
+        </w:rPr>
+      </w:pPr>
+    </w:p>
+    <w:p>
+      <w:pPr>
+        <w:pStyle w:val="PargrafodaLista"/>
+        <w:tabs>
+          <w:tab w:val="left" w:pos="1275"/>
+        </w:tabs>
+        <w:ind w:left="1080"/>
+        <w:rPr>
+          <w:sz w:val="24"/>
+          <w:szCs w:val="24"/>
+        </w:rPr>
+      </w:pPr>
+      <w:r>
+        <w:rPr>
+          <w:sz w:val="24"/>
+          <w:szCs w:val="24"/>
+        </w:rPr>
+        <w:drawing>
+          <wp:inline distT="0" distB="0" distL="0" distR="0" wp14:anchorId="31CF3D85" wp14:editId="6E2CCE16">
+            <wp:extent cx="2648320" cy="800212"/>
+            <wp:effectExtent l="0" t="0" r="0" b="0"/>
+            <wp:docPr id="193" name="Imagem 193"/>
+            <wp:cNvGraphicFramePr>
+              <a:graphicFrameLocks xmlns:a="http://schemas.openxmlformats.org/drawingml/2006/main" noChangeAspect="1"/>
+            </wp:cNvGraphicFramePr>
+            <a:graphic xmlns:a="http://schemas.openxmlformats.org/drawingml/2006/main">
+              <a:graphicData uri="http://schemas.openxmlformats.org/drawingml/2006/picture">
+                <pic:pic xmlns:pic="http://schemas.openxmlformats.org/drawingml/2006/picture">
+                  <pic:nvPicPr>
+                    <pic:cNvPr id="1" name=""/>
+                    <pic:cNvPicPr/>
+                  </pic:nvPicPr>
+                  <pic:blipFill>
+                    <a:blip r:embed="rId155"/>
+                    <a:stretch>
+                      <a:fillRect/>
+                    </a:stretch>
+                  </pic:blipFill>
+                  <pic:spPr>
+                    <a:xfrm>
+                      <a:off x="0" y="0"/>
+                      <a:ext cx="2648320" cy="800212"/>
+                    </a:xfrm>
+                    <a:prstGeom prst="rect">
+                      <a:avLst/>
+                    </a:prstGeom>
+                  </pic:spPr>
+                </pic:pic>
+              </a:graphicData>
+            </a:graphic>
+          </wp:inline>
+        </w:drawing>
+      </w:r>
+    </w:p>
+    <w:p>
+      <w:pPr>
+        <w:pStyle w:val="PargrafodaLista"/>
+        <w:tabs>
+          <w:tab w:val="left" w:pos="1275"/>
+        </w:tabs>
+        <w:ind w:left="1080"/>
+        <w:rPr>
+          <w:sz w:val="24"/>
+          <w:szCs w:val="24"/>
+        </w:rPr>
+      </w:pPr>
+    </w:p>
+    <w:p>
+      <w:pPr>
+        <w:pStyle w:val="PargrafodaLista"/>
+        <w:tabs>
+          <w:tab w:val="left" w:pos="1275"/>
+        </w:tabs>
+        <w:ind w:left="1080"/>
+        <w:rPr>
+          <w:sz w:val="24"/>
+          <w:szCs w:val="24"/>
+        </w:rPr>
+      </w:pPr>
+      <w:r>
+        <w:rPr>
+          <w:sz w:val="24"/>
+          <w:szCs w:val="24"/>
+        </w:rPr>
+        <w:t xml:space="preserve">104 – na </w:t>
+      </w:r>
+      <w:proofErr w:type="spellStart"/>
+      <w:proofErr w:type="gramStart"/>
+      <w:r>
+        <w:rPr>
+          <w:sz w:val="24"/>
+          <w:szCs w:val="24"/>
+        </w:rPr>
+        <w:t>class</w:t>
+      </w:r>
+      <w:proofErr w:type="spellEnd"/>
+      <w:r>
+        <w:rPr>
+          <w:sz w:val="24"/>
+          <w:szCs w:val="24"/>
+        </w:rPr>
+        <w:t xml:space="preserve"> .produtos</w:t>
+      </w:r>
+      <w:proofErr w:type="gramEnd"/>
+      <w:r>
+        <w:rPr>
+          <w:sz w:val="24"/>
+          <w:szCs w:val="24"/>
+        </w:rPr>
+        <w:t xml:space="preserve">  colocamos os seguintes códigos:</w:t>
+      </w:r>
+    </w:p>
+    <w:p>
+      <w:pPr>
+        <w:pStyle w:val="PargrafodaLista"/>
+        <w:numPr>
+          <w:ilvl w:val="0"/>
+          <w:numId w:val="6"/>
+        </w:numPr>
+        <w:tabs>
+          <w:tab w:val="left" w:pos="1275"/>
+        </w:tabs>
+        <w:rPr>
+          <w:sz w:val="24"/>
+          <w:szCs w:val="24"/>
+        </w:rPr>
+      </w:pPr>
+      <w:r>
+        <w:rPr>
+          <w:sz w:val="24"/>
+          <w:szCs w:val="24"/>
+        </w:rPr>
+        <w:t>Produto aparecer 100% da tela em largura</w:t>
+      </w:r>
+    </w:p>
+    <w:p>
+      <w:pPr>
+        <w:pStyle w:val="PargrafodaLista"/>
+        <w:numPr>
+          <w:ilvl w:val="0"/>
+          <w:numId w:val="6"/>
+        </w:numPr>
+        <w:tabs>
+          <w:tab w:val="left" w:pos="1275"/>
+        </w:tabs>
+        <w:rPr>
+          <w:sz w:val="24"/>
+          <w:szCs w:val="24"/>
+        </w:rPr>
+      </w:pPr>
+      <w:r>
+        <w:rPr>
+          <w:sz w:val="24"/>
+          <w:szCs w:val="24"/>
+        </w:rPr>
+        <w:t xml:space="preserve">Aumentamos o espaço interno 10px para todos os lados </w:t>
+      </w:r>
+    </w:p>
+    <w:p>
+      <w:pPr>
+        <w:pStyle w:val="PargrafodaLista"/>
+        <w:numPr>
+          <w:ilvl w:val="0"/>
+          <w:numId w:val="6"/>
+        </w:numPr>
+        <w:tabs>
+          <w:tab w:val="left" w:pos="1275"/>
+        </w:tabs>
+        <w:rPr>
+          <w:sz w:val="24"/>
+          <w:szCs w:val="24"/>
+        </w:rPr>
+      </w:pPr>
+      <w:r>
+        <w:rPr>
+          <w:sz w:val="24"/>
+          <w:szCs w:val="24"/>
+        </w:rPr>
+        <w:t>Ao colocar box-</w:t>
+      </w:r>
+      <w:proofErr w:type="spellStart"/>
+      <w:r>
+        <w:rPr>
+          <w:sz w:val="24"/>
+          <w:szCs w:val="24"/>
+        </w:rPr>
+        <w:t>sizing</w:t>
+      </w:r>
+      <w:proofErr w:type="spellEnd"/>
+      <w:r>
+        <w:rPr>
+          <w:sz w:val="24"/>
+          <w:szCs w:val="24"/>
+        </w:rPr>
+        <w:t>: não contamos o tamanho da borda</w:t>
+      </w:r>
+    </w:p>
+    <w:p>
+      <w:pPr>
+        <w:tabs>
+          <w:tab w:val="left" w:pos="1275"/>
+        </w:tabs>
+        <w:ind w:left="1080"/>
+        <w:rPr>
+          <w:sz w:val="24"/>
+          <w:szCs w:val="24"/>
+        </w:rPr>
+      </w:pPr>
+      <w:r>
+        <w:rPr>
+          <w:sz w:val="24"/>
+          <w:szCs w:val="24"/>
+        </w:rPr>
+        <w:drawing>
+          <wp:inline distT="0" distB="0" distL="0" distR="0" wp14:anchorId="6A48EC1E" wp14:editId="6A1C9BE2">
+            <wp:extent cx="2762636" cy="1000265"/>
+            <wp:effectExtent l="0" t="0" r="0" b="9525"/>
+            <wp:docPr id="195" name="Imagem 195"/>
+            <wp:cNvGraphicFramePr>
+              <a:graphicFrameLocks xmlns:a="http://schemas.openxmlformats.org/drawingml/2006/main" noChangeAspect="1"/>
+            </wp:cNvGraphicFramePr>
+            <a:graphic xmlns:a="http://schemas.openxmlformats.org/drawingml/2006/main">
+              <a:graphicData uri="http://schemas.openxmlformats.org/drawingml/2006/picture">
+                <pic:pic xmlns:pic="http://schemas.openxmlformats.org/drawingml/2006/picture">
+                  <pic:nvPicPr>
+                    <pic:cNvPr id="1" name=""/>
+                    <pic:cNvPicPr/>
+                  </pic:nvPicPr>
+                  <pic:blipFill>
+                    <a:blip r:embed="rId156"/>
+                    <a:stretch>
+                      <a:fillRect/>
+                    </a:stretch>
+                  </pic:blipFill>
+                  <pic:spPr>
+                    <a:xfrm>
+                      <a:off x="0" y="0"/>
+                      <a:ext cx="2762636" cy="1000265"/>
+                    </a:xfrm>
+                    <a:prstGeom prst="rect">
+                      <a:avLst/>
+                    </a:prstGeom>
+                  </pic:spPr>
+                </pic:pic>
+              </a:graphicData>
+            </a:graphic>
+          </wp:inline>
+        </w:drawing>
+      </w:r>
+    </w:p>
+    <w:p>
+      <w:pPr>
+        <w:tabs>
+          <w:tab w:val="left" w:pos="1275"/>
+        </w:tabs>
+        <w:ind w:left="1080"/>
+        <w:rPr>
+          <w:sz w:val="24"/>
+          <w:szCs w:val="24"/>
+        </w:rPr>
+      </w:pPr>
+    </w:p>
+    <w:p>
+      <w:pPr>
+        <w:tabs>
+          <w:tab w:val="left" w:pos="1275"/>
+        </w:tabs>
+        <w:ind w:left="1080"/>
+        <w:rPr>
+          <w:sz w:val="24"/>
+          <w:szCs w:val="24"/>
+        </w:rPr>
+      </w:pPr>
+      <w:r>
+        <w:rPr>
+          <w:sz w:val="24"/>
+          <w:szCs w:val="24"/>
+        </w:rPr>
+        <w:t xml:space="preserve">105 – Na </w:t>
+      </w:r>
+      <w:proofErr w:type="spellStart"/>
+      <w:proofErr w:type="gramStart"/>
+      <w:r>
+        <w:rPr>
+          <w:sz w:val="24"/>
+          <w:szCs w:val="24"/>
+        </w:rPr>
+        <w:t>class</w:t>
+      </w:r>
+      <w:proofErr w:type="spellEnd"/>
+      <w:r>
+        <w:rPr>
+          <w:sz w:val="24"/>
+          <w:szCs w:val="24"/>
+        </w:rPr>
+        <w:t xml:space="preserve"> .produtos</w:t>
+      </w:r>
+      <w:proofErr w:type="gramEnd"/>
+      <w:r>
+        <w:rPr>
+          <w:sz w:val="24"/>
+          <w:szCs w:val="24"/>
+        </w:rPr>
+        <w:t xml:space="preserve"> li deixamos </w:t>
+      </w:r>
+    </w:p>
+    <w:p>
+      <w:pPr>
+        <w:pStyle w:val="PargrafodaLista"/>
+        <w:numPr>
+          <w:ilvl w:val="0"/>
+          <w:numId w:val="7"/>
+        </w:numPr>
+        <w:tabs>
+          <w:tab w:val="left" w:pos="1275"/>
+        </w:tabs>
+        <w:rPr>
+          <w:sz w:val="24"/>
+          <w:szCs w:val="24"/>
+        </w:rPr>
+      </w:pPr>
+      <w:r>
+        <w:rPr>
+          <w:sz w:val="24"/>
+          <w:szCs w:val="24"/>
+        </w:rPr>
+        <w:t xml:space="preserve">Cada item de produtos ficar um embaixo do outro </w:t>
+      </w:r>
+    </w:p>
+    <w:p>
+      <w:pPr>
+        <w:pStyle w:val="PargrafodaLista"/>
+        <w:numPr>
+          <w:ilvl w:val="0"/>
+          <w:numId w:val="7"/>
+        </w:numPr>
+        <w:tabs>
+          <w:tab w:val="left" w:pos="1275"/>
+        </w:tabs>
+        <w:rPr>
+          <w:sz w:val="24"/>
+          <w:szCs w:val="24"/>
+        </w:rPr>
+      </w:pPr>
+      <w:r>
+        <w:rPr>
+          <w:sz w:val="24"/>
+          <w:szCs w:val="24"/>
+        </w:rPr>
+        <w:t>Cada item do produto aparecer na tela do celular com 100% de largura</w:t>
+      </w:r>
+    </w:p>
+    <w:p>
+      <w:pPr>
+        <w:pStyle w:val="PargrafodaLista"/>
+        <w:numPr>
+          <w:ilvl w:val="0"/>
+          <w:numId w:val="7"/>
+        </w:numPr>
+        <w:tabs>
+          <w:tab w:val="left" w:pos="1275"/>
+        </w:tabs>
+        <w:rPr>
+          <w:sz w:val="24"/>
+          <w:szCs w:val="24"/>
+        </w:rPr>
+      </w:pPr>
+      <w:r>
+        <w:rPr>
+          <w:sz w:val="24"/>
+          <w:szCs w:val="24"/>
+        </w:rPr>
+        <w:t>Demos um espaço externo tanto pra cima como para baixo de 10px</w:t>
+      </w:r>
+    </w:p>
+    <w:p>
+      <w:pPr>
+        <w:pStyle w:val="PargrafodaLista"/>
+        <w:numPr>
+          <w:ilvl w:val="0"/>
+          <w:numId w:val="7"/>
+        </w:numPr>
+        <w:tabs>
+          <w:tab w:val="left" w:pos="1275"/>
+        </w:tabs>
+        <w:rPr>
+          <w:sz w:val="24"/>
+          <w:szCs w:val="24"/>
+        </w:rPr>
+      </w:pPr>
+      <w:proofErr w:type="gramStart"/>
+      <w:r>
+        <w:rPr>
+          <w:sz w:val="24"/>
+          <w:szCs w:val="24"/>
+        </w:rPr>
+        <w:t>E Utilizamos</w:t>
+      </w:r>
+      <w:proofErr w:type="gramEnd"/>
+      <w:r>
+        <w:rPr>
+          <w:sz w:val="24"/>
+          <w:szCs w:val="24"/>
+        </w:rPr>
+        <w:t xml:space="preserve"> o box-</w:t>
+      </w:r>
+      <w:proofErr w:type="spellStart"/>
+      <w:r>
+        <w:rPr>
+          <w:sz w:val="24"/>
+          <w:szCs w:val="24"/>
+        </w:rPr>
+        <w:t>sizing</w:t>
+      </w:r>
+      <w:proofErr w:type="spellEnd"/>
+      <w:r>
+        <w:rPr>
+          <w:sz w:val="24"/>
+          <w:szCs w:val="24"/>
+        </w:rPr>
+        <w:t xml:space="preserve"> para não contar o valor da borda</w:t>
+      </w:r>
+    </w:p>
+    <w:p>
+      <w:pPr>
+        <w:tabs>
+          <w:tab w:val="left" w:pos="1275"/>
+        </w:tabs>
+        <w:ind w:left="1080"/>
+        <w:rPr>
+          <w:sz w:val="24"/>
+          <w:szCs w:val="24"/>
+        </w:rPr>
+      </w:pPr>
+      <w:r>
+        <w:rPr>
+          <w:sz w:val="24"/>
+          <w:szCs w:val="24"/>
+        </w:rPr>
+        <w:lastRenderedPageBreak/>
+        <w:drawing>
+          <wp:inline distT="0" distB="0" distL="0" distR="0" wp14:anchorId="1C079936" wp14:editId="4E97D446">
+            <wp:extent cx="2724530" cy="952633"/>
+            <wp:effectExtent l="0" t="0" r="0" b="0"/>
+            <wp:docPr id="196" name="Imagem 196"/>
+            <wp:cNvGraphicFramePr>
+              <a:graphicFrameLocks xmlns:a="http://schemas.openxmlformats.org/drawingml/2006/main" noChangeAspect="1"/>
+            </wp:cNvGraphicFramePr>
+            <a:graphic xmlns:a="http://schemas.openxmlformats.org/drawingml/2006/main">
+              <a:graphicData uri="http://schemas.openxmlformats.org/drawingml/2006/picture">
+                <pic:pic xmlns:pic="http://schemas.openxmlformats.org/drawingml/2006/picture">
+                  <pic:nvPicPr>
+                    <pic:cNvPr id="1" name=""/>
+                    <pic:cNvPicPr/>
+                  </pic:nvPicPr>
+                  <pic:blipFill>
+                    <a:blip r:embed="rId157"/>
+                    <a:stretch>
+                      <a:fillRect/>
+                    </a:stretch>
+                  </pic:blipFill>
+                  <pic:spPr>
+                    <a:xfrm>
+                      <a:off x="0" y="0"/>
+                      <a:ext cx="2724530" cy="952633"/>
+                    </a:xfrm>
+                    <a:prstGeom prst="rect">
+                      <a:avLst/>
+                    </a:prstGeom>
+                  </pic:spPr>
+                </pic:pic>
+              </a:graphicData>
+            </a:graphic>
+          </wp:inline>
+        </w:drawing>
+      </w:r>
+    </w:p>
+    <w:p>
+      <w:pPr>
+        <w:tabs>
+          <w:tab w:val="left" w:pos="1275"/>
+        </w:tabs>
+        <w:ind w:left="1080"/>
+        <w:rPr>
+          <w:sz w:val="24"/>
+          <w:szCs w:val="24"/>
+        </w:rPr>
+      </w:pPr>
+    </w:p>
+    <w:p>
+      <w:pPr>
+        <w:tabs>
+          <w:tab w:val="left" w:pos="1275"/>
+        </w:tabs>
+        <w:ind w:left="1080"/>
+        <w:rPr>
+          <w:sz w:val="24"/>
+          <w:szCs w:val="24"/>
+        </w:rPr>
+      </w:pPr>
+      <w:r>
+        <w:rPr>
+          <w:sz w:val="24"/>
+          <w:szCs w:val="24"/>
+        </w:rPr>
+        <w:t xml:space="preserve">106 </w:t>
+      </w:r>
+      <w:r>
+        <w:rPr>
+          <w:sz w:val="24"/>
+          <w:szCs w:val="24"/>
+        </w:rPr>
+        <w:t xml:space="preserve">– </w:t>
+      </w:r>
+      <w:proofErr w:type="gramStart"/>
+      <w:r>
+        <w:rPr>
+          <w:sz w:val="24"/>
+          <w:szCs w:val="24"/>
+        </w:rPr>
+        <w:t>na</w:t>
+      </w:r>
+      <w:proofErr w:type="gramEnd"/>
+      <w:r>
+        <w:rPr>
+          <w:sz w:val="24"/>
+          <w:szCs w:val="24"/>
+        </w:rPr>
+        <w:t xml:space="preserve"> página dos contatos</w:t>
+      </w:r>
+      <w:r>
+        <w:rPr>
+          <w:sz w:val="24"/>
+          <w:szCs w:val="24"/>
+        </w:rPr>
+        <w:t xml:space="preserve"> para deixar responsivo, colocamos os seguintes códigos </w:t>
+      </w:r>
+    </w:p>
+    <w:p>
+      <w:pPr>
+        <w:pStyle w:val="PargrafodaLista"/>
+        <w:numPr>
+          <w:ilvl w:val="0"/>
+          <w:numId w:val="9"/>
+        </w:numPr>
+        <w:tabs>
+          <w:tab w:val="left" w:pos="1275"/>
+        </w:tabs>
+        <w:rPr>
+          <w:sz w:val="24"/>
+          <w:szCs w:val="24"/>
+        </w:rPr>
+      </w:pPr>
+      <w:r>
+        <w:rPr>
+          <w:sz w:val="24"/>
+          <w:szCs w:val="24"/>
+        </w:rPr>
+        <w:t xml:space="preserve">Deixamos o menu responsivo utilizando o </w:t>
+      </w:r>
+      <w:r>
+        <w:rPr>
+          <w:sz w:val="24"/>
+          <w:szCs w:val="24"/>
+        </w:rPr>
+        <w:t xml:space="preserve">mesmo </w:t>
+      </w:r>
+      <w:r>
+        <w:rPr>
+          <w:sz w:val="24"/>
+          <w:szCs w:val="24"/>
+        </w:rPr>
+        <w:t xml:space="preserve">código anterior das páginas Index e Produtos, </w:t>
+      </w:r>
+    </w:p>
+    <w:p>
+      <w:pPr>
+        <w:tabs>
+          <w:tab w:val="left" w:pos="1275"/>
+        </w:tabs>
+        <w:ind w:left="1080"/>
+        <w:rPr>
+          <w:sz w:val="24"/>
+          <w:szCs w:val="24"/>
+        </w:rPr>
+      </w:pPr>
+      <w:r>
+        <w:rPr>
+          <w:sz w:val="24"/>
+          <w:szCs w:val="24"/>
+        </w:rPr>
+        <w:drawing>
+          <wp:inline distT="0" distB="0" distL="0" distR="0" wp14:anchorId="1D1A5607" wp14:editId="357F2C51">
+            <wp:extent cx="3181794" cy="2333951"/>
+            <wp:effectExtent l="0" t="0" r="0" b="9525"/>
+            <wp:docPr id="197" name="Imagem 197"/>
+            <wp:cNvGraphicFramePr>
+              <a:graphicFrameLocks xmlns:a="http://schemas.openxmlformats.org/drawingml/2006/main" noChangeAspect="1"/>
+            </wp:cNvGraphicFramePr>
+            <a:graphic xmlns:a="http://schemas.openxmlformats.org/drawingml/2006/main">
+              <a:graphicData uri="http://schemas.openxmlformats.org/drawingml/2006/picture">
+                <pic:pic xmlns:pic="http://schemas.openxmlformats.org/drawingml/2006/picture">
+                  <pic:nvPicPr>
+                    <pic:cNvPr id="1" name=""/>
+                    <pic:cNvPicPr/>
+                  </pic:nvPicPr>
+                  <pic:blipFill>
+                    <a:blip r:embed="rId158"/>
+                    <a:stretch>
+                      <a:fillRect/>
+                    </a:stretch>
+                  </pic:blipFill>
+                  <pic:spPr>
+                    <a:xfrm>
+                      <a:off x="0" y="0"/>
+                      <a:ext cx="3181794" cy="2333951"/>
+                    </a:xfrm>
+                    <a:prstGeom prst="rect">
+                      <a:avLst/>
+                    </a:prstGeom>
+                  </pic:spPr>
+                </pic:pic>
+              </a:graphicData>
+            </a:graphic>
+          </wp:inline>
+        </w:drawing>
+      </w:r>
+    </w:p>
+    <w:p>
+      <w:pPr>
+        <w:tabs>
+          <w:tab w:val="left" w:pos="1275"/>
+        </w:tabs>
+        <w:ind w:left="1080"/>
+        <w:rPr>
+          <w:sz w:val="24"/>
+          <w:szCs w:val="24"/>
+        </w:rPr>
+      </w:pPr>
+    </w:p>
+    <w:p>
+      <w:pPr>
+        <w:tabs>
+          <w:tab w:val="left" w:pos="1275"/>
+        </w:tabs>
+        <w:ind w:left="1080"/>
+        <w:rPr>
+          <w:sz w:val="24"/>
+          <w:szCs w:val="24"/>
+        </w:rPr>
+      </w:pPr>
+      <w:r>
+        <w:rPr>
+          <w:sz w:val="24"/>
+          <w:szCs w:val="24"/>
+        </w:rPr>
+        <w:t xml:space="preserve">107 – </w:t>
+      </w:r>
+      <w:proofErr w:type="gramStart"/>
+      <w:r>
+        <w:rPr>
+          <w:sz w:val="24"/>
+          <w:szCs w:val="24"/>
+        </w:rPr>
+        <w:t>no</w:t>
+      </w:r>
+      <w:proofErr w:type="gramEnd"/>
+      <w:r>
+        <w:rPr>
+          <w:sz w:val="24"/>
+          <w:szCs w:val="24"/>
+        </w:rPr>
+        <w:t xml:space="preserve"> </w:t>
+      </w:r>
+      <w:proofErr w:type="spellStart"/>
+      <w:r>
+        <w:rPr>
+          <w:sz w:val="24"/>
+          <w:szCs w:val="24"/>
+        </w:rPr>
+        <w:t>main</w:t>
+      </w:r>
+      <w:proofErr w:type="spellEnd"/>
+      <w:r>
+        <w:rPr>
+          <w:sz w:val="24"/>
+          <w:szCs w:val="24"/>
+        </w:rPr>
+        <w:t xml:space="preserve"> onde se encontra o formulário deixamos que a largura seja automática e demos um espaço interno para a esquerda conforme o código</w:t>
+      </w:r>
+    </w:p>
+    <w:p>
+      <w:pPr>
+        <w:tabs>
+          <w:tab w:val="left" w:pos="1275"/>
+        </w:tabs>
+        <w:ind w:left="1080"/>
+        <w:rPr>
+          <w:sz w:val="24"/>
+          <w:szCs w:val="24"/>
+        </w:rPr>
+      </w:pPr>
+      <w:r>
+        <w:rPr>
+          <w:sz w:val="24"/>
+          <w:szCs w:val="24"/>
+        </w:rPr>
+        <w:drawing>
+          <wp:inline distT="0" distB="0" distL="0" distR="0" wp14:anchorId="363C0354" wp14:editId="5A6A3E70">
+            <wp:extent cx="2572109" cy="914528"/>
+            <wp:effectExtent l="0" t="0" r="0" b="0"/>
+            <wp:docPr id="198" name="Imagem 198"/>
+            <wp:cNvGraphicFramePr>
+              <a:graphicFrameLocks xmlns:a="http://schemas.openxmlformats.org/drawingml/2006/main" noChangeAspect="1"/>
+            </wp:cNvGraphicFramePr>
+            <a:graphic xmlns:a="http://schemas.openxmlformats.org/drawingml/2006/main">
+              <a:graphicData uri="http://schemas.openxmlformats.org/drawingml/2006/picture">
+                <pic:pic xmlns:pic="http://schemas.openxmlformats.org/drawingml/2006/picture">
+                  <pic:nvPicPr>
+                    <pic:cNvPr id="1" name=""/>
+                    <pic:cNvPicPr/>
+                  </pic:nvPicPr>
+                  <pic:blipFill>
+                    <a:blip r:embed="rId159"/>
+                    <a:stretch>
+                      <a:fillRect/>
+                    </a:stretch>
+                  </pic:blipFill>
+                  <pic:spPr>
+                    <a:xfrm>
+                      <a:off x="0" y="0"/>
+                      <a:ext cx="2572109" cy="914528"/>
+                    </a:xfrm>
+                    <a:prstGeom prst="rect">
+                      <a:avLst/>
+                    </a:prstGeom>
+                  </pic:spPr>
+                </pic:pic>
+              </a:graphicData>
+            </a:graphic>
+          </wp:inline>
+        </w:drawing>
+      </w:r>
+    </w:p>
+    <w:p>
+      <w:pPr>
+        <w:tabs>
+          <w:tab w:val="left" w:pos="1275"/>
+        </w:tabs>
+        <w:ind w:left="1080"/>
+        <w:rPr>
+          <w:sz w:val="24"/>
+          <w:szCs w:val="24"/>
+        </w:rPr>
+      </w:pPr>
+    </w:p>
+    <w:p>
+      <w:pPr>
+        <w:tabs>
+          <w:tab w:val="left" w:pos="1275"/>
+        </w:tabs>
+        <w:ind w:left="1080"/>
+        <w:rPr>
+          <w:sz w:val="24"/>
+          <w:szCs w:val="24"/>
+        </w:rPr>
+      </w:pPr>
+      <w:r>
+        <w:rPr>
+          <w:sz w:val="24"/>
+          <w:szCs w:val="24"/>
+        </w:rPr>
+        <w:t xml:space="preserve">108 – </w:t>
+      </w:r>
+      <w:proofErr w:type="gramStart"/>
+      <w:r>
+        <w:rPr>
+          <w:sz w:val="24"/>
+          <w:szCs w:val="24"/>
+        </w:rPr>
+        <w:t>no</w:t>
+      </w:r>
+      <w:proofErr w:type="gramEnd"/>
+      <w:r>
+        <w:rPr>
+          <w:sz w:val="24"/>
+          <w:szCs w:val="24"/>
+        </w:rPr>
+        <w:t xml:space="preserve"> input deixamos da seguinte forma </w:t>
+      </w:r>
+    </w:p>
+    <w:p>
+      <w:pPr>
+        <w:pStyle w:val="PargrafodaLista"/>
+        <w:numPr>
+          <w:ilvl w:val="0"/>
+          <w:numId w:val="9"/>
+        </w:numPr>
+        <w:tabs>
+          <w:tab w:val="left" w:pos="1275"/>
+        </w:tabs>
+        <w:rPr>
+          <w:sz w:val="24"/>
+          <w:szCs w:val="24"/>
+        </w:rPr>
+      </w:pPr>
+      <w:r>
+        <w:rPr>
+          <w:sz w:val="24"/>
+          <w:szCs w:val="24"/>
+        </w:rPr>
+        <w:t>Para cada item do input-padrão ocupasse 90% de largura</w:t>
+      </w:r>
+    </w:p>
+    <w:p>
+      <w:pPr>
+        <w:pStyle w:val="PargrafodaLista"/>
+        <w:numPr>
+          <w:ilvl w:val="0"/>
+          <w:numId w:val="9"/>
+        </w:numPr>
+        <w:tabs>
+          <w:tab w:val="left" w:pos="1275"/>
+        </w:tabs>
+        <w:rPr>
+          <w:sz w:val="24"/>
+          <w:szCs w:val="24"/>
+        </w:rPr>
+      </w:pPr>
+      <w:r>
+        <w:rPr>
+          <w:sz w:val="24"/>
+          <w:szCs w:val="24"/>
+        </w:rPr>
+        <w:t>E demos um espaço interno para todos os lados de 10px</w:t>
+      </w:r>
+    </w:p>
+    <w:p>
+      <w:pPr>
+        <w:tabs>
+          <w:tab w:val="left" w:pos="1275"/>
+        </w:tabs>
+        <w:ind w:left="1080"/>
+        <w:rPr>
+          <w:sz w:val="24"/>
+          <w:szCs w:val="24"/>
+        </w:rPr>
+      </w:pPr>
+      <w:r>
+        <w:rPr>
+          <w:sz w:val="24"/>
+          <w:szCs w:val="24"/>
+        </w:rPr>
+        <w:t xml:space="preserve">             </w:t>
+      </w:r>
+      <w:r>
+        <w:rPr>
+          <w:sz w:val="24"/>
+          <w:szCs w:val="24"/>
+        </w:rPr>
+        <w:drawing>
+          <wp:inline distT="0" distB="0" distL="0" distR="0" wp14:anchorId="0C90B552" wp14:editId="7630A6A1">
+            <wp:extent cx="1838582" cy="857370"/>
+            <wp:effectExtent l="0" t="0" r="9525" b="0"/>
+            <wp:docPr id="199" name="Imagem 199"/>
+            <wp:cNvGraphicFramePr>
+              <a:graphicFrameLocks xmlns:a="http://schemas.openxmlformats.org/drawingml/2006/main" noChangeAspect="1"/>
+            </wp:cNvGraphicFramePr>
+            <a:graphic xmlns:a="http://schemas.openxmlformats.org/drawingml/2006/main">
+              <a:graphicData uri="http://schemas.openxmlformats.org/drawingml/2006/picture">
+                <pic:pic xmlns:pic="http://schemas.openxmlformats.org/drawingml/2006/picture">
+                  <pic:nvPicPr>
+                    <pic:cNvPr id="1" name=""/>
+                    <pic:cNvPicPr/>
+                  </pic:nvPicPr>
+                  <pic:blipFill>
+                    <a:blip r:embed="rId160"/>
+                    <a:stretch>
+                      <a:fillRect/>
+                    </a:stretch>
+                  </pic:blipFill>
+                  <pic:spPr>
+                    <a:xfrm>
+                      <a:off x="0" y="0"/>
+                      <a:ext cx="1838582" cy="857370"/>
+                    </a:xfrm>
+                    <a:prstGeom prst="rect">
+                      <a:avLst/>
+                    </a:prstGeom>
+                  </pic:spPr>
+                </pic:pic>
+              </a:graphicData>
+            </a:graphic>
+          </wp:inline>
+        </w:drawing>
+      </w:r>
+    </w:p>
+    <w:p>
+      <w:pPr>
+        <w:tabs>
+          <w:tab w:val="left" w:pos="1275"/>
+        </w:tabs>
+        <w:ind w:left="1080"/>
+        <w:rPr>
+          <w:sz w:val="24"/>
+          <w:szCs w:val="24"/>
+        </w:rPr>
+      </w:pPr>
+    </w:p>
+    <w:p>
+      <w:pPr>
+        <w:tabs>
+          <w:tab w:val="left" w:pos="1275"/>
+        </w:tabs>
+        <w:ind w:left="1080"/>
+        <w:rPr>
+          <w:sz w:val="24"/>
+          <w:szCs w:val="24"/>
+        </w:rPr>
+      </w:pPr>
+      <w:r>
+        <w:rPr>
+          <w:sz w:val="24"/>
+          <w:szCs w:val="24"/>
+        </w:rPr>
+        <w:t xml:space="preserve">109 – </w:t>
+      </w:r>
+      <w:proofErr w:type="gramStart"/>
+      <w:r>
+        <w:rPr>
+          <w:sz w:val="24"/>
+          <w:szCs w:val="24"/>
+        </w:rPr>
+        <w:t>no</w:t>
+      </w:r>
+      <w:proofErr w:type="gramEnd"/>
+      <w:r>
+        <w:rPr>
+          <w:sz w:val="24"/>
+          <w:szCs w:val="24"/>
+        </w:rPr>
+        <w:t xml:space="preserve"> botão enviar ficou da seguinte forma </w:t>
+      </w:r>
+    </w:p>
+    <w:p>
+      <w:pPr>
+        <w:pStyle w:val="PargrafodaLista"/>
+        <w:numPr>
+          <w:ilvl w:val="0"/>
+          <w:numId w:val="10"/>
+        </w:numPr>
+        <w:tabs>
+          <w:tab w:val="left" w:pos="1275"/>
+        </w:tabs>
+        <w:rPr>
+          <w:sz w:val="24"/>
+          <w:szCs w:val="24"/>
+        </w:rPr>
+      </w:pPr>
+      <w:r>
+        <w:rPr>
+          <w:sz w:val="24"/>
+          <w:szCs w:val="24"/>
+        </w:rPr>
+        <w:t>Demos uma largura para o botão de 80%</w:t>
+      </w:r>
+    </w:p>
+    <w:p>
+      <w:pPr>
+        <w:pStyle w:val="PargrafodaLista"/>
+        <w:numPr>
+          <w:ilvl w:val="0"/>
+          <w:numId w:val="10"/>
+        </w:numPr>
+        <w:tabs>
+          <w:tab w:val="left" w:pos="1275"/>
+        </w:tabs>
+        <w:rPr>
+          <w:sz w:val="24"/>
+          <w:szCs w:val="24"/>
+        </w:rPr>
+      </w:pPr>
+      <w:r>
+        <w:rPr>
+          <w:sz w:val="24"/>
+          <w:szCs w:val="24"/>
+        </w:rPr>
+        <w:t>Aumenta o espaço interno de 15px para todos os lados</w:t>
+      </w:r>
+    </w:p>
+    <w:p>
+      <w:pPr>
+        <w:pStyle w:val="PargrafodaLista"/>
+        <w:numPr>
+          <w:ilvl w:val="0"/>
+          <w:numId w:val="10"/>
+        </w:numPr>
+        <w:tabs>
+          <w:tab w:val="left" w:pos="1275"/>
+        </w:tabs>
+        <w:rPr>
+          <w:sz w:val="24"/>
+          <w:szCs w:val="24"/>
+        </w:rPr>
+      </w:pPr>
+      <w:r>
+        <w:rPr>
+          <w:sz w:val="24"/>
+          <w:szCs w:val="24"/>
+        </w:rPr>
+        <w:t>Aumentamos o tamanho da fonte para 16px</w:t>
+      </w:r>
+    </w:p>
+    <w:p>
+      <w:pPr>
+        <w:tabs>
+          <w:tab w:val="left" w:pos="1275"/>
+        </w:tabs>
+        <w:ind w:left="1080"/>
+        <w:rPr>
+          <w:sz w:val="24"/>
+          <w:szCs w:val="24"/>
+        </w:rPr>
+      </w:pPr>
+      <w:r>
+        <w:rPr>
+          <w:sz w:val="24"/>
+          <w:szCs w:val="24"/>
+        </w:rPr>
+        <w:drawing>
+          <wp:inline distT="0" distB="0" distL="0" distR="0" wp14:anchorId="5AE588F4" wp14:editId="1EBEDB3A">
+            <wp:extent cx="2057687" cy="1124107"/>
+            <wp:effectExtent l="0" t="0" r="0" b="0"/>
+            <wp:docPr id="201" name="Imagem 201"/>
+            <wp:cNvGraphicFramePr>
+              <a:graphicFrameLocks xmlns:a="http://schemas.openxmlformats.org/drawingml/2006/main" noChangeAspect="1"/>
+            </wp:cNvGraphicFramePr>
+            <a:graphic xmlns:a="http://schemas.openxmlformats.org/drawingml/2006/main">
+              <a:graphicData uri="http://schemas.openxmlformats.org/drawingml/2006/picture">
+                <pic:pic xmlns:pic="http://schemas.openxmlformats.org/drawingml/2006/picture">
+                  <pic:nvPicPr>
+                    <pic:cNvPr id="1" name=""/>
+                    <pic:cNvPicPr/>
+                  </pic:nvPicPr>
+                  <pic:blipFill>
+                    <a:blip r:embed="rId161"/>
+                    <a:stretch>
+                      <a:fillRect/>
+                    </a:stretch>
+                  </pic:blipFill>
+                  <pic:spPr>
+                    <a:xfrm>
+                      <a:off x="0" y="0"/>
+                      <a:ext cx="2057687" cy="1124107"/>
+                    </a:xfrm>
+                    <a:prstGeom prst="rect">
+                      <a:avLst/>
+                    </a:prstGeom>
+                  </pic:spPr>
+                </pic:pic>
+              </a:graphicData>
+            </a:graphic>
+          </wp:inline>
+        </w:drawing>
+      </w:r>
+    </w:p>
+    <w:p>
+      <w:pPr>
+        <w:tabs>
+          <w:tab w:val="left" w:pos="1275"/>
+        </w:tabs>
+        <w:ind w:left="1080"/>
+        <w:rPr>
+          <w:sz w:val="24"/>
+          <w:szCs w:val="24"/>
+        </w:rPr>
+      </w:pPr>
+    </w:p>
+    <w:p>
+      <w:pPr>
+        <w:tabs>
+          <w:tab w:val="left" w:pos="1275"/>
+        </w:tabs>
+        <w:ind w:left="1080"/>
+        <w:rPr>
+          <w:sz w:val="24"/>
+          <w:szCs w:val="24"/>
+        </w:rPr>
+      </w:pPr>
+      <w:r>
+        <w:rPr>
+          <w:sz w:val="24"/>
+          <w:szCs w:val="24"/>
+        </w:rPr>
+        <w:t>OBS * se o bloco de mensagem ficar para fora da tela</w:t>
+      </w:r>
+    </w:p>
+    <w:p>
+      <w:pPr>
+        <w:tabs>
+          <w:tab w:val="left" w:pos="1275"/>
+        </w:tabs>
+        <w:ind w:left="1080"/>
+        <w:rPr>
+          <w:sz w:val="24"/>
+          <w:szCs w:val="24"/>
+        </w:rPr>
+      </w:pPr>
+      <w:r>
+        <w:rPr>
+          <w:sz w:val="24"/>
+          <w:szCs w:val="24"/>
+        </w:rPr>
+        <w:t xml:space="preserve">Mude a quantidade de colunas no </w:t>
+      </w:r>
+      <w:proofErr w:type="spellStart"/>
+      <w:r>
+        <w:rPr>
+          <w:sz w:val="24"/>
+          <w:szCs w:val="24"/>
+        </w:rPr>
+        <w:t>html</w:t>
+      </w:r>
+      <w:proofErr w:type="spellEnd"/>
+      <w:r>
+        <w:rPr>
+          <w:sz w:val="24"/>
+          <w:szCs w:val="24"/>
+        </w:rPr>
+        <w:t>, ponha para 50 por exemplo</w:t>
+      </w:r>
+    </w:p>
+    <w:p>
+      <w:pPr>
+        <w:tabs>
+          <w:tab w:val="left" w:pos="1275"/>
+        </w:tabs>
+        <w:ind w:left="1080"/>
+        <w:rPr>
+          <w:sz w:val="24"/>
+          <w:szCs w:val="24"/>
+        </w:rPr>
+      </w:pPr>
+      <w:r>
+        <w:rPr>
+          <w:sz w:val="24"/>
+          <w:szCs w:val="24"/>
+        </w:rPr>
+        <w:drawing>
+          <wp:inline distT="0" distB="0" distL="0" distR="0" wp14:anchorId="0C8EB8EF" wp14:editId="30A14E5F">
+            <wp:extent cx="5163271" cy="685896"/>
+            <wp:effectExtent l="0" t="0" r="0" b="0"/>
+            <wp:docPr id="202" name="Imagem 202"/>
+            <wp:cNvGraphicFramePr>
+              <a:graphicFrameLocks xmlns:a="http://schemas.openxmlformats.org/drawingml/2006/main" noChangeAspect="1"/>
+            </wp:cNvGraphicFramePr>
+            <a:graphic xmlns:a="http://schemas.openxmlformats.org/drawingml/2006/main">
+              <a:graphicData uri="http://schemas.openxmlformats.org/drawingml/2006/picture">
+                <pic:pic xmlns:pic="http://schemas.openxmlformats.org/drawingml/2006/picture">
+                  <pic:nvPicPr>
+                    <pic:cNvPr id="1" name=""/>
+                    <pic:cNvPicPr/>
+                  </pic:nvPicPr>
+                  <pic:blipFill>
+                    <a:blip r:embed="rId162"/>
+                    <a:stretch>
+                      <a:fillRect/>
+                    </a:stretch>
+                  </pic:blipFill>
+                  <pic:spPr>
+                    <a:xfrm>
+                      <a:off x="0" y="0"/>
+                      <a:ext cx="5163271" cy="685896"/>
+                    </a:xfrm>
+                    <a:prstGeom prst="rect">
+                      <a:avLst/>
+                    </a:prstGeom>
+                  </pic:spPr>
+                </pic:pic>
+              </a:graphicData>
+            </a:graphic>
+          </wp:inline>
+        </w:drawing>
+      </w:r>
+      <w:bookmarkStart w:id="0" w:name="_GoBack"/>
       <w:bookmarkEnd w:id="0"/>
-    </w:p>
-    <w:p>
-      <w:pPr>
-        <w:pStyle w:val="PargrafodaLista"/>
-        <w:tabs>
-          <w:tab w:val="left" w:pos="1275"/>
-        </w:tabs>
-        <w:ind w:left="1080"/>
-        <w:rPr>
-          <w:sz w:val="24"/>
-          <w:szCs w:val="24"/>
-        </w:rPr>
-      </w:pPr>
-    </w:p>
-    <w:p>
-      <w:pPr>
-        <w:pStyle w:val="PargrafodaLista"/>
-        <w:tabs>
-          <w:tab w:val="left" w:pos="1275"/>
-        </w:tabs>
-        <w:ind w:left="1080"/>
-        <w:rPr>
-          <w:sz w:val="24"/>
-          <w:szCs w:val="24"/>
-        </w:rPr>
-      </w:pPr>
     </w:p>
     <w:sectPr>
       <w:pgSz w:w="11906" w:h="16838"/>
@@ -22513,6 +23911,232 @@
 <file path=word/numbering.xml><?xml version="1.0" encoding="utf-8"?>
 <w:numbering xmlns:wpc="http://schemas.microsoft.com/office/word/2010/wordprocessingCanvas" xmlns:cx="http://schemas.microsoft.com/office/drawing/2014/chartex" xmlns:cx1="http://schemas.microsoft.com/office/drawing/2015/9/8/chartex" xmlns:cx2="http://schemas.microsoft.com/office/drawing/2015/10/21/chartex" xmlns:cx3="http://schemas.microsoft.com/office/drawing/2016/5/9/chartex" xmlns:cx4="http://schemas.microsoft.com/office/drawing/2016/5/10/chartex" xmlns:cx5="http://schemas.microsoft.com/office/drawing/2016/5/11/chartex" xmlns:cx6="http://schemas.microsoft.com/office/drawing/2016/5/12/chartex" xmlns:cx7="http://schemas.microsoft.com/office/drawing/2016/5/13/chartex" xmlns:cx8="http://schemas.microsoft.com/office/drawing/2016/5/14/chartex" xmlns:mc="http://schemas.openxmlformats.org/markup-compatibility/2006" xmlns:aink="http://schemas.microsoft.com/office/drawing/2016/ink" xmlns:am3d="http://schemas.microsoft.com/office/drawing/2017/model3d" xmlns:o="urn:schemas-microsoft-com:office:office" xmlns:r="http://schemas.openxmlformats.org/officeDocument/2006/relationships" xmlns:m="http://schemas.openxmlformats.org/officeDocument/2006/math" xmlns:v="urn:schemas-microsoft-com:vml" xmlns:wp14="http://schemas.microsoft.com/office/word/2010/wordprocessingDrawing" xmlns:wp="http://schemas.openxmlformats.org/drawingml/2006/wordprocessingDrawing" xmlns:w10="urn:schemas-microsoft-com:office:word" xmlns:w="http://schemas.openxmlformats.org/wordprocessingml/2006/main" xmlns:w14="http://schemas.microsoft.com/office/word/2010/wordml" xmlns:w15="http://schemas.microsoft.com/office/word/2012/wordml" xmlns:w16cid="http://schemas.microsoft.com/office/word/2016/wordml/cid" xmlns:w16se="http://schemas.microsoft.com/office/word/2015/wordml/symex" xmlns:wpg="http://schemas.microsoft.com/office/word/2010/wordprocessingGroup" xmlns:wpi="http://schemas.microsoft.com/office/word/2010/wordprocessingInk" xmlns:wne="http://schemas.microsoft.com/office/word/2006/wordml" xmlns:wps="http://schemas.microsoft.com/office/word/2010/wordprocessingShape" mc:Ignorable="w14 w15 w16se w16cid wp14">
   <w:abstractNum w:abstractNumId="0" w15:restartNumberingAfterBreak="0">
+    <w:nsid w:val="1BE72634"/>
+    <w:multiLevelType w:val="hybridMultilevel"/>
+    <w:tmpl w:val="9CACE986"/>
+    <w:lvl w:ilvl="0" w:tplc="04160001">
+      <w:start w:val="1"/>
+      <w:numFmt w:val="bullet"/>
+      <w:lvlText w:val=""/>
+      <w:lvlJc w:val="left"/>
+      <w:pPr>
+        <w:ind w:left="1800" w:hanging="360"/>
+      </w:pPr>
+      <w:rPr>
+        <w:rFonts w:ascii="Symbol" w:hAnsi="Symbol" w:hint="default"/>
+      </w:rPr>
+    </w:lvl>
+    <w:lvl w:ilvl="1" w:tplc="04160003" w:tentative="1">
+      <w:start w:val="1"/>
+      <w:numFmt w:val="bullet"/>
+      <w:lvlText w:val="o"/>
+      <w:lvlJc w:val="left"/>
+      <w:pPr>
+        <w:ind w:left="2520" w:hanging="360"/>
+      </w:pPr>
+      <w:rPr>
+        <w:rFonts w:ascii="Courier New" w:hAnsi="Courier New" w:cs="Courier New" w:hint="default"/>
+      </w:rPr>
+    </w:lvl>
+    <w:lvl w:ilvl="2" w:tplc="04160005" w:tentative="1">
+      <w:start w:val="1"/>
+      <w:numFmt w:val="bullet"/>
+      <w:lvlText w:val=""/>
+      <w:lvlJc w:val="left"/>
+      <w:pPr>
+        <w:ind w:left="3240" w:hanging="360"/>
+      </w:pPr>
+      <w:rPr>
+        <w:rFonts w:ascii="Wingdings" w:hAnsi="Wingdings" w:hint="default"/>
+      </w:rPr>
+    </w:lvl>
+    <w:lvl w:ilvl="3" w:tplc="04160001" w:tentative="1">
+      <w:start w:val="1"/>
+      <w:numFmt w:val="bullet"/>
+      <w:lvlText w:val=""/>
+      <w:lvlJc w:val="left"/>
+      <w:pPr>
+        <w:ind w:left="3960" w:hanging="360"/>
+      </w:pPr>
+      <w:rPr>
+        <w:rFonts w:ascii="Symbol" w:hAnsi="Symbol" w:hint="default"/>
+      </w:rPr>
+    </w:lvl>
+    <w:lvl w:ilvl="4" w:tplc="04160003" w:tentative="1">
+      <w:start w:val="1"/>
+      <w:numFmt w:val="bullet"/>
+      <w:lvlText w:val="o"/>
+      <w:lvlJc w:val="left"/>
+      <w:pPr>
+        <w:ind w:left="4680" w:hanging="360"/>
+      </w:pPr>
+      <w:rPr>
+        <w:rFonts w:ascii="Courier New" w:hAnsi="Courier New" w:cs="Courier New" w:hint="default"/>
+      </w:rPr>
+    </w:lvl>
+    <w:lvl w:ilvl="5" w:tplc="04160005" w:tentative="1">
+      <w:start w:val="1"/>
+      <w:numFmt w:val="bullet"/>
+      <w:lvlText w:val=""/>
+      <w:lvlJc w:val="left"/>
+      <w:pPr>
+        <w:ind w:left="5400" w:hanging="360"/>
+      </w:pPr>
+      <w:rPr>
+        <w:rFonts w:ascii="Wingdings" w:hAnsi="Wingdings" w:hint="default"/>
+      </w:rPr>
+    </w:lvl>
+    <w:lvl w:ilvl="6" w:tplc="04160001" w:tentative="1">
+      <w:start w:val="1"/>
+      <w:numFmt w:val="bullet"/>
+      <w:lvlText w:val=""/>
+      <w:lvlJc w:val="left"/>
+      <w:pPr>
+        <w:ind w:left="6120" w:hanging="360"/>
+      </w:pPr>
+      <w:rPr>
+        <w:rFonts w:ascii="Symbol" w:hAnsi="Symbol" w:hint="default"/>
+      </w:rPr>
+    </w:lvl>
+    <w:lvl w:ilvl="7" w:tplc="04160003" w:tentative="1">
+      <w:start w:val="1"/>
+      <w:numFmt w:val="bullet"/>
+      <w:lvlText w:val="o"/>
+      <w:lvlJc w:val="left"/>
+      <w:pPr>
+        <w:ind w:left="6840" w:hanging="360"/>
+      </w:pPr>
+      <w:rPr>
+        <w:rFonts w:ascii="Courier New" w:hAnsi="Courier New" w:cs="Courier New" w:hint="default"/>
+      </w:rPr>
+    </w:lvl>
+    <w:lvl w:ilvl="8" w:tplc="04160005" w:tentative="1">
+      <w:start w:val="1"/>
+      <w:numFmt w:val="bullet"/>
+      <w:lvlText w:val=""/>
+      <w:lvlJc w:val="left"/>
+      <w:pPr>
+        <w:ind w:left="7560" w:hanging="360"/>
+      </w:pPr>
+      <w:rPr>
+        <w:rFonts w:ascii="Wingdings" w:hAnsi="Wingdings" w:hint="default"/>
+      </w:rPr>
+    </w:lvl>
+  </w:abstractNum>
+  <w:abstractNum w:abstractNumId="1" w15:restartNumberingAfterBreak="0">
+    <w:nsid w:val="21EA42AD"/>
+    <w:multiLevelType w:val="hybridMultilevel"/>
+    <w:tmpl w:val="422AD23C"/>
+    <w:lvl w:ilvl="0" w:tplc="04160001">
+      <w:start w:val="1"/>
+      <w:numFmt w:val="bullet"/>
+      <w:lvlText w:val=""/>
+      <w:lvlJc w:val="left"/>
+      <w:pPr>
+        <w:ind w:left="1800" w:hanging="360"/>
+      </w:pPr>
+      <w:rPr>
+        <w:rFonts w:ascii="Symbol" w:hAnsi="Symbol" w:hint="default"/>
+      </w:rPr>
+    </w:lvl>
+    <w:lvl w:ilvl="1" w:tplc="04160003" w:tentative="1">
+      <w:start w:val="1"/>
+      <w:numFmt w:val="bullet"/>
+      <w:lvlText w:val="o"/>
+      <w:lvlJc w:val="left"/>
+      <w:pPr>
+        <w:ind w:left="2520" w:hanging="360"/>
+      </w:pPr>
+      <w:rPr>
+        <w:rFonts w:ascii="Courier New" w:hAnsi="Courier New" w:cs="Courier New" w:hint="default"/>
+      </w:rPr>
+    </w:lvl>
+    <w:lvl w:ilvl="2" w:tplc="04160005" w:tentative="1">
+      <w:start w:val="1"/>
+      <w:numFmt w:val="bullet"/>
+      <w:lvlText w:val=""/>
+      <w:lvlJc w:val="left"/>
+      <w:pPr>
+        <w:ind w:left="3240" w:hanging="360"/>
+      </w:pPr>
+      <w:rPr>
+        <w:rFonts w:ascii="Wingdings" w:hAnsi="Wingdings" w:hint="default"/>
+      </w:rPr>
+    </w:lvl>
+    <w:lvl w:ilvl="3" w:tplc="04160001" w:tentative="1">
+      <w:start w:val="1"/>
+      <w:numFmt w:val="bullet"/>
+      <w:lvlText w:val=""/>
+      <w:lvlJc w:val="left"/>
+      <w:pPr>
+        <w:ind w:left="3960" w:hanging="360"/>
+      </w:pPr>
+      <w:rPr>
+        <w:rFonts w:ascii="Symbol" w:hAnsi="Symbol" w:hint="default"/>
+      </w:rPr>
+    </w:lvl>
+    <w:lvl w:ilvl="4" w:tplc="04160003" w:tentative="1">
+      <w:start w:val="1"/>
+      <w:numFmt w:val="bullet"/>
+      <w:lvlText w:val="o"/>
+      <w:lvlJc w:val="left"/>
+      <w:pPr>
+        <w:ind w:left="4680" w:hanging="360"/>
+      </w:pPr>
+      <w:rPr>
+        <w:rFonts w:ascii="Courier New" w:hAnsi="Courier New" w:cs="Courier New" w:hint="default"/>
+      </w:rPr>
+    </w:lvl>
+    <w:lvl w:ilvl="5" w:tplc="04160005" w:tentative="1">
+      <w:start w:val="1"/>
+      <w:numFmt w:val="bullet"/>
+      <w:lvlText w:val=""/>
+      <w:lvlJc w:val="left"/>
+      <w:pPr>
+        <w:ind w:left="5400" w:hanging="360"/>
+      </w:pPr>
+      <w:rPr>
+        <w:rFonts w:ascii="Wingdings" w:hAnsi="Wingdings" w:hint="default"/>
+      </w:rPr>
+    </w:lvl>
+    <w:lvl w:ilvl="6" w:tplc="04160001" w:tentative="1">
+      <w:start w:val="1"/>
+      <w:numFmt w:val="bullet"/>
+      <w:lvlText w:val=""/>
+      <w:lvlJc w:val="left"/>
+      <w:pPr>
+        <w:ind w:left="6120" w:hanging="360"/>
+      </w:pPr>
+      <w:rPr>
+        <w:rFonts w:ascii="Symbol" w:hAnsi="Symbol" w:hint="default"/>
+      </w:rPr>
+    </w:lvl>
+    <w:lvl w:ilvl="7" w:tplc="04160003" w:tentative="1">
+      <w:start w:val="1"/>
+      <w:numFmt w:val="bullet"/>
+      <w:lvlText w:val="o"/>
+      <w:lvlJc w:val="left"/>
+      <w:pPr>
+        <w:ind w:left="6840" w:hanging="360"/>
+      </w:pPr>
+      <w:rPr>
+        <w:rFonts w:ascii="Courier New" w:hAnsi="Courier New" w:cs="Courier New" w:hint="default"/>
+      </w:rPr>
+    </w:lvl>
+    <w:lvl w:ilvl="8" w:tplc="04160005" w:tentative="1">
+      <w:start w:val="1"/>
+      <w:numFmt w:val="bullet"/>
+      <w:lvlText w:val=""/>
+      <w:lvlJc w:val="left"/>
+      <w:pPr>
+        <w:ind w:left="7560" w:hanging="360"/>
+      </w:pPr>
+      <w:rPr>
+        <w:rFonts w:ascii="Wingdings" w:hAnsi="Wingdings" w:hint="default"/>
+      </w:rPr>
+    </w:lvl>
+  </w:abstractNum>
+  <w:abstractNum w:abstractNumId="2" w15:restartNumberingAfterBreak="0">
     <w:nsid w:val="27D53EA7"/>
     <w:multiLevelType w:val="hybridMultilevel"/>
     <w:tmpl w:val="5CCA194C"/>
@@ -22625,7 +24249,7 @@
       </w:rPr>
     </w:lvl>
   </w:abstractNum>
-  <w:abstractNum w:abstractNumId="1" w15:restartNumberingAfterBreak="0">
+  <w:abstractNum w:abstractNumId="3" w15:restartNumberingAfterBreak="0">
     <w:nsid w:val="2A983B07"/>
     <w:multiLevelType w:val="hybridMultilevel"/>
     <w:tmpl w:val="6C381386"/>
@@ -22738,17 +24362,17 @@
       </w:rPr>
     </w:lvl>
   </w:abstractNum>
-  <w:abstractNum w:abstractNumId="2" w15:restartNumberingAfterBreak="0">
-    <w:nsid w:val="73775E98"/>
+  <w:abstractNum w:abstractNumId="4" w15:restartNumberingAfterBreak="0">
+    <w:nsid w:val="35083FA8"/>
     <w:multiLevelType w:val="hybridMultilevel"/>
-    <w:tmpl w:val="6CAC59DE"/>
+    <w:tmpl w:val="A0DA4A1A"/>
     <w:lvl w:ilvl="0" w:tplc="04160001">
       <w:start w:val="1"/>
       <w:numFmt w:val="bullet"/>
       <w:lvlText w:val=""/>
       <w:lvlJc w:val="left"/>
       <w:pPr>
-        <w:ind w:left="720" w:hanging="360"/>
+        <w:ind w:left="1800" w:hanging="360"/>
       </w:pPr>
       <w:rPr>
         <w:rFonts w:ascii="Symbol" w:hAnsi="Symbol" w:hint="default"/>
@@ -22760,7 +24384,7 @@
       <w:lvlText w:val="o"/>
       <w:lvlJc w:val="left"/>
       <w:pPr>
-        <w:ind w:left="1440" w:hanging="360"/>
+        <w:ind w:left="2520" w:hanging="360"/>
       </w:pPr>
       <w:rPr>
         <w:rFonts w:ascii="Courier New" w:hAnsi="Courier New" w:cs="Courier New" w:hint="default"/>
@@ -22772,7 +24396,7 @@
       <w:lvlText w:val=""/>
       <w:lvlJc w:val="left"/>
       <w:pPr>
-        <w:ind w:left="2160" w:hanging="360"/>
+        <w:ind w:left="3240" w:hanging="360"/>
       </w:pPr>
       <w:rPr>
         <w:rFonts w:ascii="Wingdings" w:hAnsi="Wingdings" w:hint="default"/>
@@ -22784,7 +24408,7 @@
       <w:lvlText w:val=""/>
       <w:lvlJc w:val="left"/>
       <w:pPr>
-        <w:ind w:left="2880" w:hanging="360"/>
+        <w:ind w:left="3960" w:hanging="360"/>
       </w:pPr>
       <w:rPr>
         <w:rFonts w:ascii="Symbol" w:hAnsi="Symbol" w:hint="default"/>
@@ -22796,7 +24420,7 @@
       <w:lvlText w:val="o"/>
       <w:lvlJc w:val="left"/>
       <w:pPr>
-        <w:ind w:left="3600" w:hanging="360"/>
+        <w:ind w:left="4680" w:hanging="360"/>
       </w:pPr>
       <w:rPr>
         <w:rFonts w:ascii="Courier New" w:hAnsi="Courier New" w:cs="Courier New" w:hint="default"/>
@@ -22808,7 +24432,7 @@
       <w:lvlText w:val=""/>
       <w:lvlJc w:val="left"/>
       <w:pPr>
-        <w:ind w:left="4320" w:hanging="360"/>
+        <w:ind w:left="5400" w:hanging="360"/>
       </w:pPr>
       <w:rPr>
         <w:rFonts w:ascii="Wingdings" w:hAnsi="Wingdings" w:hint="default"/>
@@ -22820,7 +24444,7 @@
       <w:lvlText w:val=""/>
       <w:lvlJc w:val="left"/>
       <w:pPr>
-        <w:ind w:left="5040" w:hanging="360"/>
+        <w:ind w:left="6120" w:hanging="360"/>
       </w:pPr>
       <w:rPr>
         <w:rFonts w:ascii="Symbol" w:hAnsi="Symbol" w:hint="default"/>
@@ -22832,7 +24456,7 @@
       <w:lvlText w:val="o"/>
       <w:lvlJc w:val="left"/>
       <w:pPr>
-        <w:ind w:left="5760" w:hanging="360"/>
+        <w:ind w:left="6840" w:hanging="360"/>
       </w:pPr>
       <w:rPr>
         <w:rFonts w:ascii="Courier New" w:hAnsi="Courier New" w:cs="Courier New" w:hint="default"/>
@@ -22844,14 +24468,353 @@
       <w:lvlText w:val=""/>
       <w:lvlJc w:val="left"/>
       <w:pPr>
-        <w:ind w:left="6480" w:hanging="360"/>
+        <w:ind w:left="7560" w:hanging="360"/>
       </w:pPr>
       <w:rPr>
         <w:rFonts w:ascii="Wingdings" w:hAnsi="Wingdings" w:hint="default"/>
       </w:rPr>
     </w:lvl>
   </w:abstractNum>
-  <w:abstractNum w:abstractNumId="3" w15:restartNumberingAfterBreak="0">
+  <w:abstractNum w:abstractNumId="5" w15:restartNumberingAfterBreak="0">
+    <w:nsid w:val="5DE56103"/>
+    <w:multiLevelType w:val="hybridMultilevel"/>
+    <w:tmpl w:val="11949AF4"/>
+    <w:lvl w:ilvl="0" w:tplc="04160001">
+      <w:start w:val="1"/>
+      <w:numFmt w:val="bullet"/>
+      <w:lvlText w:val=""/>
+      <w:lvlJc w:val="left"/>
+      <w:pPr>
+        <w:ind w:left="1800" w:hanging="360"/>
+      </w:pPr>
+      <w:rPr>
+        <w:rFonts w:ascii="Symbol" w:hAnsi="Symbol" w:hint="default"/>
+      </w:rPr>
+    </w:lvl>
+    <w:lvl w:ilvl="1" w:tplc="04160003" w:tentative="1">
+      <w:start w:val="1"/>
+      <w:numFmt w:val="bullet"/>
+      <w:lvlText w:val="o"/>
+      <w:lvlJc w:val="left"/>
+      <w:pPr>
+        <w:ind w:left="2520" w:hanging="360"/>
+      </w:pPr>
+      <w:rPr>
+        <w:rFonts w:ascii="Courier New" w:hAnsi="Courier New" w:cs="Courier New" w:hint="default"/>
+      </w:rPr>
+    </w:lvl>
+    <w:lvl w:ilvl="2" w:tplc="04160005" w:tentative="1">
+      <w:start w:val="1"/>
+      <w:numFmt w:val="bullet"/>
+      <w:lvlText w:val=""/>
+      <w:lvlJc w:val="left"/>
+      <w:pPr>
+        <w:ind w:left="3240" w:hanging="360"/>
+      </w:pPr>
+      <w:rPr>
+        <w:rFonts w:ascii="Wingdings" w:hAnsi="Wingdings" w:hint="default"/>
+      </w:rPr>
+    </w:lvl>
+    <w:lvl w:ilvl="3" w:tplc="04160001" w:tentative="1">
+      <w:start w:val="1"/>
+      <w:numFmt w:val="bullet"/>
+      <w:lvlText w:val=""/>
+      <w:lvlJc w:val="left"/>
+      <w:pPr>
+        <w:ind w:left="3960" w:hanging="360"/>
+      </w:pPr>
+      <w:rPr>
+        <w:rFonts w:ascii="Symbol" w:hAnsi="Symbol" w:hint="default"/>
+      </w:rPr>
+    </w:lvl>
+    <w:lvl w:ilvl="4" w:tplc="04160003" w:tentative="1">
+      <w:start w:val="1"/>
+      <w:numFmt w:val="bullet"/>
+      <w:lvlText w:val="o"/>
+      <w:lvlJc w:val="left"/>
+      <w:pPr>
+        <w:ind w:left="4680" w:hanging="360"/>
+      </w:pPr>
+      <w:rPr>
+        <w:rFonts w:ascii="Courier New" w:hAnsi="Courier New" w:cs="Courier New" w:hint="default"/>
+      </w:rPr>
+    </w:lvl>
+    <w:lvl w:ilvl="5" w:tplc="04160005" w:tentative="1">
+      <w:start w:val="1"/>
+      <w:numFmt w:val="bullet"/>
+      <w:lvlText w:val=""/>
+      <w:lvlJc w:val="left"/>
+      <w:pPr>
+        <w:ind w:left="5400" w:hanging="360"/>
+      </w:pPr>
+      <w:rPr>
+        <w:rFonts w:ascii="Wingdings" w:hAnsi="Wingdings" w:hint="default"/>
+      </w:rPr>
+    </w:lvl>
+    <w:lvl w:ilvl="6" w:tplc="04160001" w:tentative="1">
+      <w:start w:val="1"/>
+      <w:numFmt w:val="bullet"/>
+      <w:lvlText w:val=""/>
+      <w:lvlJc w:val="left"/>
+      <w:pPr>
+        <w:ind w:left="6120" w:hanging="360"/>
+      </w:pPr>
+      <w:rPr>
+        <w:rFonts w:ascii="Symbol" w:hAnsi="Symbol" w:hint="default"/>
+      </w:rPr>
+    </w:lvl>
+    <w:lvl w:ilvl="7" w:tplc="04160003" w:tentative="1">
+      <w:start w:val="1"/>
+      <w:numFmt w:val="bullet"/>
+      <w:lvlText w:val="o"/>
+      <w:lvlJc w:val="left"/>
+      <w:pPr>
+        <w:ind w:left="6840" w:hanging="360"/>
+      </w:pPr>
+      <w:rPr>
+        <w:rFonts w:ascii="Courier New" w:hAnsi="Courier New" w:cs="Courier New" w:hint="default"/>
+      </w:rPr>
+    </w:lvl>
+    <w:lvl w:ilvl="8" w:tplc="04160005" w:tentative="1">
+      <w:start w:val="1"/>
+      <w:numFmt w:val="bullet"/>
+      <w:lvlText w:val=""/>
+      <w:lvlJc w:val="left"/>
+      <w:pPr>
+        <w:ind w:left="7560" w:hanging="360"/>
+      </w:pPr>
+      <w:rPr>
+        <w:rFonts w:ascii="Wingdings" w:hAnsi="Wingdings" w:hint="default"/>
+      </w:rPr>
+    </w:lvl>
+  </w:abstractNum>
+  <w:abstractNum w:abstractNumId="6" w15:restartNumberingAfterBreak="0">
+    <w:nsid w:val="6694033F"/>
+    <w:multiLevelType w:val="hybridMultilevel"/>
+    <w:tmpl w:val="89FC1D62"/>
+    <w:lvl w:ilvl="0" w:tplc="04160001">
+      <w:start w:val="1"/>
+      <w:numFmt w:val="bullet"/>
+      <w:lvlText w:val=""/>
+      <w:lvlJc w:val="left"/>
+      <w:pPr>
+        <w:ind w:left="1800" w:hanging="360"/>
+      </w:pPr>
+      <w:rPr>
+        <w:rFonts w:ascii="Symbol" w:hAnsi="Symbol" w:hint="default"/>
+      </w:rPr>
+    </w:lvl>
+    <w:lvl w:ilvl="1" w:tplc="04160003" w:tentative="1">
+      <w:start w:val="1"/>
+      <w:numFmt w:val="bullet"/>
+      <w:lvlText w:val="o"/>
+      <w:lvlJc w:val="left"/>
+      <w:pPr>
+        <w:ind w:left="2520" w:hanging="360"/>
+      </w:pPr>
+      <w:rPr>
+        <w:rFonts w:ascii="Courier New" w:hAnsi="Courier New" w:cs="Courier New" w:hint="default"/>
+      </w:rPr>
+    </w:lvl>
+    <w:lvl w:ilvl="2" w:tplc="04160005" w:tentative="1">
+      <w:start w:val="1"/>
+      <w:numFmt w:val="bullet"/>
+      <w:lvlText w:val=""/>
+      <w:lvlJc w:val="left"/>
+      <w:pPr>
+        <w:ind w:left="3240" w:hanging="360"/>
+      </w:pPr>
+      <w:rPr>
+        <w:rFonts w:ascii="Wingdings" w:hAnsi="Wingdings" w:hint="default"/>
+      </w:rPr>
+    </w:lvl>
+    <w:lvl w:ilvl="3" w:tplc="04160001" w:tentative="1">
+      <w:start w:val="1"/>
+      <w:numFmt w:val="bullet"/>
+      <w:lvlText w:val=""/>
+      <w:lvlJc w:val="left"/>
+      <w:pPr>
+        <w:ind w:left="3960" w:hanging="360"/>
+      </w:pPr>
+      <w:rPr>
+        <w:rFonts w:ascii="Symbol" w:hAnsi="Symbol" w:hint="default"/>
+      </w:rPr>
+    </w:lvl>
+    <w:lvl w:ilvl="4" w:tplc="04160003" w:tentative="1">
+      <w:start w:val="1"/>
+      <w:numFmt w:val="bullet"/>
+      <w:lvlText w:val="o"/>
+      <w:lvlJc w:val="left"/>
+      <w:pPr>
+        <w:ind w:left="4680" w:hanging="360"/>
+      </w:pPr>
+      <w:rPr>
+        <w:rFonts w:ascii="Courier New" w:hAnsi="Courier New" w:cs="Courier New" w:hint="default"/>
+      </w:rPr>
+    </w:lvl>
+    <w:lvl w:ilvl="5" w:tplc="04160005" w:tentative="1">
+      <w:start w:val="1"/>
+      <w:numFmt w:val="bullet"/>
+      <w:lvlText w:val=""/>
+      <w:lvlJc w:val="left"/>
+      <w:pPr>
+        <w:ind w:left="5400" w:hanging="360"/>
+      </w:pPr>
+      <w:rPr>
+        <w:rFonts w:ascii="Wingdings" w:hAnsi="Wingdings" w:hint="default"/>
+      </w:rPr>
+    </w:lvl>
+    <w:lvl w:ilvl="6" w:tplc="04160001" w:tentative="1">
+      <w:start w:val="1"/>
+      <w:numFmt w:val="bullet"/>
+      <w:lvlText w:val=""/>
+      <w:lvlJc w:val="left"/>
+      <w:pPr>
+        <w:ind w:left="6120" w:hanging="360"/>
+      </w:pPr>
+      <w:rPr>
+        <w:rFonts w:ascii="Symbol" w:hAnsi="Symbol" w:hint="default"/>
+      </w:rPr>
+    </w:lvl>
+    <w:lvl w:ilvl="7" w:tplc="04160003" w:tentative="1">
+      <w:start w:val="1"/>
+      <w:numFmt w:val="bullet"/>
+      <w:lvlText w:val="o"/>
+      <w:lvlJc w:val="left"/>
+      <w:pPr>
+        <w:ind w:left="6840" w:hanging="360"/>
+      </w:pPr>
+      <w:rPr>
+        <w:rFonts w:ascii="Courier New" w:hAnsi="Courier New" w:cs="Courier New" w:hint="default"/>
+      </w:rPr>
+    </w:lvl>
+    <w:lvl w:ilvl="8" w:tplc="04160005" w:tentative="1">
+      <w:start w:val="1"/>
+      <w:numFmt w:val="bullet"/>
+      <w:lvlText w:val=""/>
+      <w:lvlJc w:val="left"/>
+      <w:pPr>
+        <w:ind w:left="7560" w:hanging="360"/>
+      </w:pPr>
+      <w:rPr>
+        <w:rFonts w:ascii="Wingdings" w:hAnsi="Wingdings" w:hint="default"/>
+      </w:rPr>
+    </w:lvl>
+  </w:abstractNum>
+  <w:abstractNum w:abstractNumId="7" w15:restartNumberingAfterBreak="0">
+    <w:nsid w:val="73775E98"/>
+    <w:multiLevelType w:val="hybridMultilevel"/>
+    <w:tmpl w:val="6CAC59DE"/>
+    <w:lvl w:ilvl="0" w:tplc="04160001">
+      <w:start w:val="1"/>
+      <w:numFmt w:val="bullet"/>
+      <w:lvlText w:val=""/>
+      <w:lvlJc w:val="left"/>
+      <w:pPr>
+        <w:ind w:left="720" w:hanging="360"/>
+      </w:pPr>
+      <w:rPr>
+        <w:rFonts w:ascii="Symbol" w:hAnsi="Symbol" w:hint="default"/>
+      </w:rPr>
+    </w:lvl>
+    <w:lvl w:ilvl="1" w:tplc="04160003" w:tentative="1">
+      <w:start w:val="1"/>
+      <w:numFmt w:val="bullet"/>
+      <w:lvlText w:val="o"/>
+      <w:lvlJc w:val="left"/>
+      <w:pPr>
+        <w:ind w:left="1440" w:hanging="360"/>
+      </w:pPr>
+      <w:rPr>
+        <w:rFonts w:ascii="Courier New" w:hAnsi="Courier New" w:cs="Courier New" w:hint="default"/>
+      </w:rPr>
+    </w:lvl>
+    <w:lvl w:ilvl="2" w:tplc="04160005" w:tentative="1">
+      <w:start w:val="1"/>
+      <w:numFmt w:val="bullet"/>
+      <w:lvlText w:val=""/>
+      <w:lvlJc w:val="left"/>
+      <w:pPr>
+        <w:ind w:left="2160" w:hanging="360"/>
+      </w:pPr>
+      <w:rPr>
+        <w:rFonts w:ascii="Wingdings" w:hAnsi="Wingdings" w:hint="default"/>
+      </w:rPr>
+    </w:lvl>
+    <w:lvl w:ilvl="3" w:tplc="04160001" w:tentative="1">
+      <w:start w:val="1"/>
+      <w:numFmt w:val="bullet"/>
+      <w:lvlText w:val=""/>
+      <w:lvlJc w:val="left"/>
+      <w:pPr>
+        <w:ind w:left="2880" w:hanging="360"/>
+      </w:pPr>
+      <w:rPr>
+        <w:rFonts w:ascii="Symbol" w:hAnsi="Symbol" w:hint="default"/>
+      </w:rPr>
+    </w:lvl>
+    <w:lvl w:ilvl="4" w:tplc="04160003" w:tentative="1">
+      <w:start w:val="1"/>
+      <w:numFmt w:val="bullet"/>
+      <w:lvlText w:val="o"/>
+      <w:lvlJc w:val="left"/>
+      <w:pPr>
+        <w:ind w:left="3600" w:hanging="360"/>
+      </w:pPr>
+      <w:rPr>
+        <w:rFonts w:ascii="Courier New" w:hAnsi="Courier New" w:cs="Courier New" w:hint="default"/>
+      </w:rPr>
+    </w:lvl>
+    <w:lvl w:ilvl="5" w:tplc="04160005" w:tentative="1">
+      <w:start w:val="1"/>
+      <w:numFmt w:val="bullet"/>
+      <w:lvlText w:val=""/>
+      <w:lvlJc w:val="left"/>
+      <w:pPr>
+        <w:ind w:left="4320" w:hanging="360"/>
+      </w:pPr>
+      <w:rPr>
+        <w:rFonts w:ascii="Wingdings" w:hAnsi="Wingdings" w:hint="default"/>
+      </w:rPr>
+    </w:lvl>
+    <w:lvl w:ilvl="6" w:tplc="04160001" w:tentative="1">
+      <w:start w:val="1"/>
+      <w:numFmt w:val="bullet"/>
+      <w:lvlText w:val=""/>
+      <w:lvlJc w:val="left"/>
+      <w:pPr>
+        <w:ind w:left="5040" w:hanging="360"/>
+      </w:pPr>
+      <w:rPr>
+        <w:rFonts w:ascii="Symbol" w:hAnsi="Symbol" w:hint="default"/>
+      </w:rPr>
+    </w:lvl>
+    <w:lvl w:ilvl="7" w:tplc="04160003" w:tentative="1">
+      <w:start w:val="1"/>
+      <w:numFmt w:val="bullet"/>
+      <w:lvlText w:val="o"/>
+      <w:lvlJc w:val="left"/>
+      <w:pPr>
+        <w:ind w:left="5760" w:hanging="360"/>
+      </w:pPr>
+      <w:rPr>
+        <w:rFonts w:ascii="Courier New" w:hAnsi="Courier New" w:cs="Courier New" w:hint="default"/>
+      </w:rPr>
+    </w:lvl>
+    <w:lvl w:ilvl="8" w:tplc="04160005" w:tentative="1">
+      <w:start w:val="1"/>
+      <w:numFmt w:val="bullet"/>
+      <w:lvlText w:val=""/>
+      <w:lvlJc w:val="left"/>
+      <w:pPr>
+        <w:ind w:left="6480" w:hanging="360"/>
+      </w:pPr>
+      <w:rPr>
+        <w:rFonts w:ascii="Wingdings" w:hAnsi="Wingdings" w:hint="default"/>
+      </w:rPr>
+    </w:lvl>
+  </w:abstractNum>
+  <w:abstractNum w:abstractNumId="8" w15:restartNumberingAfterBreak="0">
     <w:nsid w:val="74DD1DF9"/>
     <w:multiLevelType w:val="hybridMultilevel"/>
     <w:tmpl w:val="198C6E64"/>
@@ -22964,7 +24927,7 @@
       </w:rPr>
     </w:lvl>
   </w:abstractNum>
-  <w:abstractNum w:abstractNumId="4" w15:restartNumberingAfterBreak="0">
+  <w:abstractNum w:abstractNumId="9" w15:restartNumberingAfterBreak="0">
     <w:nsid w:val="7548119C"/>
     <w:multiLevelType w:val="hybridMultilevel"/>
     <w:tmpl w:val="4FF4C2FC"/>
@@ -23054,19 +25017,34 @@
     </w:lvl>
   </w:abstractNum>
   <w:num w:numId="1">
+    <w:abstractNumId w:val="8"/>
+  </w:num>
+  <w:num w:numId="2">
+    <w:abstractNumId w:val="2"/>
+  </w:num>
+  <w:num w:numId="3">
     <w:abstractNumId w:val="3"/>
   </w:num>
-  <w:num w:numId="2">
-    <w:abstractNumId w:val="0"/>
+  <w:num w:numId="4">
+    <w:abstractNumId w:val="7"/>
   </w:num>
-  <w:num w:numId="3">
+  <w:num w:numId="5">
+    <w:abstractNumId w:val="9"/>
+  </w:num>
+  <w:num w:numId="6">
     <w:abstractNumId w:val="1"/>
   </w:num>
-  <w:num w:numId="4">
-    <w:abstractNumId w:val="2"/>
+  <w:num w:numId="7">
+    <w:abstractNumId w:val="6"/>
   </w:num>
-  <w:num w:numId="5">
+  <w:num w:numId="8">
     <w:abstractNumId w:val="4"/>
+  </w:num>
+  <w:num w:numId="9">
+    <w:abstractNumId w:val="5"/>
+  </w:num>
+  <w:num w:numId="10">
+    <w:abstractNumId w:val="0"/>
   </w:num>
 </w:numbering>
 </file>
@@ -23938,7 +25916,7 @@
 </file>
 
 <file path=customXml/itemProps1.xml><?xml version="1.0" encoding="utf-8"?>
-<ds:datastoreItem xmlns:ds="http://schemas.openxmlformats.org/officeDocument/2006/customXml" ds:itemID="{7B0724FC-A1EE-4E44-9F27-D44B96B6C4B2}">
+<ds:datastoreItem xmlns:ds="http://schemas.openxmlformats.org/officeDocument/2006/customXml" ds:itemID="{03843571-79B3-48B9-9086-4B2ECC4479BE}">
   <ds:schemaRefs>
     <ds:schemaRef ds:uri="http://schemas.openxmlformats.org/officeDocument/2006/bibliography"/>
   </ds:schemaRefs>

</xml_diff>